<commit_message>
docs: sync peak ModernBERT metrics and updated docx
</commit_message>
<xml_diff>
--- a/manuscript.docx
+++ b/manuscript.docx
@@ -131,7 +131,7 @@
         <w:t xml:space="preserve"> </w:t>
       </w:r>
       <w:r>
-        <w:t xml:space="preserve">On the 3,758 holdout encounters, unadapted zero-shot models failed catastrophically (1.09% to 5.46% Top-1, operating below the 3.45% random guess floor). Fine-tuning with domain vocabulary expansion transformed performance across all neural topologies: the Gemma 3 270M cross-encoder reached 60.88% Top-1 (84.17% Top-3; 413.1 ms latency), while ModernBERT 149M reached 63.07% Top-1 (86.67% Top-3; 35.7 ms latency). Standalone ELECTRA-Small (13.5M parameters, Peak Epoch 13) established the highest overall benchmark accuracy: 67.78% Top-1, 84.25% Top-2, and 90.69% Top-3 accuracy with an ECE of 0.0418 (raw 0.0357), executing in 3.2 ms per visit on GPU and 14.1 ms via INT8 quantization on CPU. ELECTRA-Small surpassed both the Linear SVM baseline (65.38% Top-1, 87.39% Top-3) and larger neural models, breaking the 90% primary care differential guidance threshold as a single model without ensembling. Feature ablation proved that physiological vitals are indispensable: ablating numerical vitals caused diagnostic collapse, with Top-1 dropping to 49.71% and 30.5% of visits falsely defaulting to general checkups (Z00).</w:t>
+        <w:t xml:space="preserve">On the 3,758 holdout encounters, unadapted zero-shot models failed catastrophically (1.09% to 5.46% Top-1, operating below the 3.45% random guess floor). Fine-tuning with domain vocabulary expansion transformed performance across all neural topologies under validation-guided early stopping: the Gemma 3 270M cross-encoder converged at Epoch 3, reaching 60.88% Top-1 (84.17% Top-3; 413.1 ms latency), while ModernBERT 149M converged at Epoch 7, reaching 65.03% Top-1 (88.16% Top-3; 36.9 ms latency). Standalone ELECTRA-Small (13.5M parameters, Peak Epoch 13) established the highest overall benchmark accuracy: 67.78% Top-1, 84.25% Top-2, and 90.69% Top-3 accuracy with an ECE of 0.0418 (raw 0.0357), executing in 3.2 ms per visit on GPU and 14.1 ms via INT8 quantization on CPU. ELECTRA-Small surpassed both the Linear SVM baseline (65.38% Top-1, 87.39% Top-3) and larger neural models, breaking the 90% primary care differential guidance threshold as a single model without ensembling. Feature ablation proved that physiological vitals are indispensable: ablating numerical vitals caused diagnostic collapse, with Top-1 dropping to 49.71% and 30.5% of visits falsely defaulting to general checkups (Z00).</w:t>
       </w:r>
     </w:p>
     <w:p>
@@ -1755,6 +1755,14 @@
       </w:pPr>
       <w:r>
         <w:t xml:space="preserve">We benchmarked four native architectural topologies for non-autoregressive decision support:</w:t>
+      </w:r>
+    </w:p>
+    <w:p>
+      <w:pPr>
+        <w:pStyle w:val="BodyText"/>
+      </w:pPr>
+      <w:r>
+        <w:t xml:space="preserve">Following standard empirical transfer learning protocols, training epochs were not arbitrarily fixed across disparate parameter scales. Instead, each architectural topology was optimized with early stopping anchored to the held-out development set (1,808 encounters). The larger 268M Gemma 3 and 149M ModernBERT models reached validation loss convergence in 3 and 7 epochs, respectively, beyond which further training induced over-parameterized memorization and validation degradation. Conversely, the compact 13.5M ELECTRA model required extended optimization across 16 epochs, reaching its global validation peak at Epoch 13 (60.23% Dev Top-1) before exhibiting empirical validation degradation.</w:t>
       </w:r>
     </w:p>
     <w:bookmarkStart w:id="19" w:name="_b8e6393ac53c2746ad4a39ba8a2c3a9669de209"/>
@@ -4183,79 +4191,79 @@
               <w:pStyle w:val="Compact"/>
             </w:pPr>
             <w:r>
-              <w:t xml:space="preserve">Marker head (+100 tokens, 4 ep, label smooth)</w:t>
-            </w:r>
-          </w:p>
-        </w:tc>
-        <w:tc>
-          <w:tcPr/>
-          <w:p>
-            <w:pPr>
-              <w:pStyle w:val="Compact"/>
-              <w:jc w:val="right"/>
-            </w:pPr>
-            <w:r>
-              <w:t xml:space="preserve">63.07%</w:t>
-            </w:r>
-          </w:p>
-        </w:tc>
-        <w:tc>
-          <w:tcPr/>
-          <w:p>
-            <w:pPr>
-              <w:pStyle w:val="Compact"/>
-              <w:jc w:val="right"/>
-            </w:pPr>
-            <w:r>
-              <w:t xml:space="preserve">78.79%</w:t>
-            </w:r>
-          </w:p>
-        </w:tc>
-        <w:tc>
-          <w:tcPr/>
-          <w:p>
-            <w:pPr>
-              <w:pStyle w:val="Compact"/>
-              <w:jc w:val="right"/>
-            </w:pPr>
-            <w:r>
-              <w:t xml:space="preserve">86.67%</w:t>
-            </w:r>
-          </w:p>
-        </w:tc>
-        <w:tc>
-          <w:tcPr/>
-          <w:p>
-            <w:pPr>
-              <w:pStyle w:val="Compact"/>
-              <w:jc w:val="right"/>
-            </w:pPr>
-            <w:r>
-              <w:t xml:space="preserve">0.3836</w:t>
-            </w:r>
-          </w:p>
-        </w:tc>
-        <w:tc>
-          <w:tcPr/>
-          <w:p>
-            <w:pPr>
-              <w:pStyle w:val="Compact"/>
-              <w:jc w:val="right"/>
-            </w:pPr>
-            <w:r>
-              <w:t xml:space="preserve">0.0358</w:t>
-            </w:r>
-          </w:p>
-        </w:tc>
-        <w:tc>
-          <w:tcPr/>
-          <w:p>
-            <w:pPr>
-              <w:pStyle w:val="Compact"/>
-              <w:jc w:val="right"/>
-            </w:pPr>
-            <w:r>
-              <w:t xml:space="preserve">35.7 ms</w:t>
+              <w:t xml:space="preserve">Marker head (+100 tokens, Peak Epoch 7, label smooth)</w:t>
+            </w:r>
+          </w:p>
+        </w:tc>
+        <w:tc>
+          <w:tcPr/>
+          <w:p>
+            <w:pPr>
+              <w:pStyle w:val="Compact"/>
+              <w:jc w:val="right"/>
+            </w:pPr>
+            <w:r>
+              <w:t xml:space="preserve">65.03%</w:t>
+            </w:r>
+          </w:p>
+        </w:tc>
+        <w:tc>
+          <w:tcPr/>
+          <w:p>
+            <w:pPr>
+              <w:pStyle w:val="Compact"/>
+              <w:jc w:val="right"/>
+            </w:pPr>
+            <w:r>
+              <w:t xml:space="preserve">81.64%</w:t>
+            </w:r>
+          </w:p>
+        </w:tc>
+        <w:tc>
+          <w:tcPr/>
+          <w:p>
+            <w:pPr>
+              <w:pStyle w:val="Compact"/>
+              <w:jc w:val="right"/>
+            </w:pPr>
+            <w:r>
+              <w:t xml:space="preserve">88.16%</w:t>
+            </w:r>
+          </w:p>
+        </w:tc>
+        <w:tc>
+          <w:tcPr/>
+          <w:p>
+            <w:pPr>
+              <w:pStyle w:val="Compact"/>
+              <w:jc w:val="right"/>
+            </w:pPr>
+            <w:r>
+              <w:t xml:space="preserve">0.4244</w:t>
+            </w:r>
+          </w:p>
+        </w:tc>
+        <w:tc>
+          <w:tcPr/>
+          <w:p>
+            <w:pPr>
+              <w:pStyle w:val="Compact"/>
+              <w:jc w:val="right"/>
+            </w:pPr>
+            <w:r>
+              <w:t xml:space="preserve">0.0311</w:t>
+            </w:r>
+          </w:p>
+        </w:tc>
+        <w:tc>
+          <w:tcPr/>
+          <w:p>
+            <w:pPr>
+              <w:pStyle w:val="Compact"/>
+              <w:jc w:val="right"/>
+            </w:pPr>
+            <w:r>
+              <w:t xml:space="preserve">36.9 ms</w:t>
             </w:r>
           </w:p>
         </w:tc>
@@ -4779,7 +4787,7 @@
         <w:t xml:space="preserve"> </w:t>
       </w:r>
       <w:r>
-        <w:t xml:space="preserve">(90.69% versus 87.39%). Furthermore, ELECTRA-Small outperformed the 20-fold larger Gemma 3 270M cross-encoder by</w:t>
+        <w:t xml:space="preserve">(90.69% versus 87.39%). Furthermore, ELECTRA-Small outperformed the 11-fold larger ModernBERT 149M model at its peak convergence epoch by</w:t>
       </w:r>
       <w:r>
         <w:t xml:space="preserve"> </w:t>
@@ -4789,13 +4797,13 @@
           <w:b/>
           <w:bCs/>
         </w:rPr>
-        <w:t xml:space="preserve">+6.90 percentage points in Top-1</w:t>
-      </w:r>
-      <w:r>
-        <w:t xml:space="preserve"> </w:t>
-      </w:r>
-      <w:r>
-        <w:t xml:space="preserve">(67.78% versus 60.88%) and</w:t>
+        <w:t xml:space="preserve">+2.75 percentage points in Top-1</w:t>
+      </w:r>
+      <w:r>
+        <w:t xml:space="preserve"> </w:t>
+      </w:r>
+      <w:r>
+        <w:t xml:space="preserve">(67.78% versus 65.03%) and</w:t>
       </w:r>
       <w:r>
         <w:t xml:space="preserve"> </w:t>
@@ -4805,13 +4813,13 @@
           <w:b/>
           <w:bCs/>
         </w:rPr>
-        <w:t xml:space="preserve">+6.52 percentage points in Top-3</w:t>
-      </w:r>
-      <w:r>
-        <w:t xml:space="preserve"> </w:t>
-      </w:r>
-      <w:r>
-        <w:t xml:space="preserve">(90.69% versus 84.17%) while executing over 120 times faster (3.2 ms versus 413.1 ms).</w:t>
+        <w:t xml:space="preserve">+2.53 percentage points in Top-3</w:t>
+      </w:r>
+      <w:r>
+        <w:t xml:space="preserve"> </w:t>
+      </w:r>
+      <w:r>
+        <w:t xml:space="preserve">(90.69% versus 88.16%), while executing over eleven times faster (3.2 ms versus 36.9 ms).</w:t>
       </w:r>
     </w:p>
     <w:p>
@@ -4843,17 +4851,17 @@
         <w:t xml:space="preserve">0.5086</w:t>
       </w:r>
       <w:r>
-        <w:t xml:space="preserve">, substantially outperforming ModernBERT (</w:t>
+        <w:t xml:space="preserve">, substantially outperforming peak ModernBERT (</w:t>
       </w:r>
       <w:r>
         <w:rPr>
           <w:b/>
           <w:bCs/>
         </w:rPr>
-        <w:t xml:space="preserve">0.3836</w:t>
-      </w:r>
-      <w:r>
-        <w:t xml:space="preserve">, a +12.50 percentage point advantage) and approaching the tuned Linear SVM baseline (</w:t>
+        <w:t xml:space="preserve">0.4244</w:t>
+      </w:r>
+      <w:r>
+        <w:t xml:space="preserve">, a +8.42 percentage point advantage) and approaching the tuned Linear SVM baseline (</w:t>
       </w:r>
       <w:r>
         <w:rPr>
@@ -5229,6 +5237,72 @@
         <w:t xml:space="preserve">accuracy with a Brier score of 0.4204.</w:t>
       </w:r>
     </w:p>
+    <w:p>
+      <w:pPr>
+        <w:pStyle w:val="FirstParagraph"/>
+      </w:pPr>
+      <w:r>
+        <w:t xml:space="preserve">Similarly, to verify whether the 149M ModernBERT model benefited from extended training, we evaluated its trajectory through Epoch 8. ModernBERT demonstrated steady convergence through Epoch 7, where validation accuracy peaked at</w:t>
+      </w:r>
+      <w:r>
+        <w:t xml:space="preserve"> </w:t>
+      </w:r>
+      <w:r>
+        <w:rPr>
+          <w:b/>
+          <w:bCs/>
+        </w:rPr>
+        <w:t xml:space="preserve">58.19% Dev Top-1</w:t>
+      </w:r>
+      <w:r>
+        <w:t xml:space="preserve"> </w:t>
+      </w:r>
+      <w:r>
+        <w:t xml:space="preserve">(87.06% Top-3; loss 1.5825), delivering holdout performance of</w:t>
+      </w:r>
+      <w:r>
+        <w:t xml:space="preserve"> </w:t>
+      </w:r>
+      <w:r>
+        <w:rPr>
+          <w:b/>
+          <w:bCs/>
+        </w:rPr>
+        <w:t xml:space="preserve">65.03% Top-1</w:t>
+      </w:r>
+      <w:r>
+        <w:t xml:space="preserve">,</w:t>
+      </w:r>
+      <w:r>
+        <w:t xml:space="preserve"> </w:t>
+      </w:r>
+      <w:r>
+        <w:rPr>
+          <w:b/>
+          <w:bCs/>
+        </w:rPr>
+        <w:t xml:space="preserve">88.16% Top-3</w:t>
+      </w:r>
+      <w:r>
+        <w:t xml:space="preserve">, and macro-F₁</w:t>
+      </w:r>
+      <w:r>
+        <w:t xml:space="preserve"> </w:t>
+      </w:r>
+      <w:r>
+        <w:rPr>
+          <w:b/>
+          <w:bCs/>
+        </w:rPr>
+        <w:t xml:space="preserve">0.4244</w:t>
+      </w:r>
+      <w:r>
+        <w:t xml:space="preserve"> </w:t>
+      </w:r>
+      <w:r>
+        <w:t xml:space="preserve">(36.9 ms latency). At Epoch 8, despite training loss continuing to descend to 1.5023, validation performance degraded to 57.91% Dev Top-1 (-0.28 percentage points). This confirmed that larger models with higher parameter capacity overfit earlier on primary care clinical corpora, whereas compact models under 15M parameters require extended optimization to fully fit decision boundaries.</w:t>
+      </w:r>
+    </w:p>
     <w:bookmarkEnd w:id="31"/>
     <w:bookmarkStart w:id="32" w:name="_79536b59cb05ee6dd8edb5a31e43554995ea1e4"/>
     <w:p>
@@ -7184,7 +7258,7 @@
         <w:t xml:space="preserve">The efficiency of bidirectional marker-pointer models</w:t>
       </w:r>
       <w:r>
-        <w:t xml:space="preserve">: ModernBERT (63.07% Top-1) and ELECTRA-Small (67.78% Top-1) surpassed Gemma 3 while running vastly faster (35.7 ms and 3.2 ms, respectively). By concatenating all 29 diagnostic markers into a single shared bidirectional prompt, marker-pointer models evaluate all candidate markers jointly within a unified self-attention matrix (</w:t>
+        <w:t xml:space="preserve">: ModernBERT (65.03% Top-1) and ELECTRA-Small (67.78% Top-1) surpassed Gemma 3 while running vastly faster (36.9 ms and 3.2 ms, respectively). By concatenating all 29 diagnostic markers into a single shared bidirectional prompt, marker-pointer models evaluate all candidate markers jointly within a unified self-attention matrix (</w:t>
       </w:r>
       <m:oMath>
         <m:r>
@@ -7259,7 +7333,7 @@
         <w:pStyle w:val="BodyText"/>
       </w:pPr>
       <w:r>
-        <w:t xml:space="preserve">While ELECTRA-Small achieved the highest overall Top-1 (67.78%) and Top-3 (90.69%) accuracy, its macro-averaged F₁ score (0.5086) was narrowly trailed by the Linear SVM baseline (0.5311, a difference of 0.0225), while substantially surpassing ModernBERT (0.3836 by +12.50 percentage points). This nuanced trade-off reflects contrasting decision boundary geometries:</w:t>
+        <w:t xml:space="preserve">While ELECTRA-Small achieved the highest overall Top-1 (67.78%) and Top-3 (90.69%) accuracy, its macro-averaged F₁ score (0.5086) was narrowly trailed by the Linear SVM baseline (0.5311, a difference of 0.0225), while substantially surpassing peak ModernBERT (0.4244 by +8.42 percentage points). This nuanced trade-off reflects contrasting decision boundary geometries:</w:t>
       </w:r>
     </w:p>
     <w:p>

</xml_diff>